<commit_message>
Fix the issue with fonts in the newly generated docx.
</commit_message>
<xml_diff>
--- a/docs/gendoc/client_contract.docx
+++ b/docs/gendoc/client_contract.docx
@@ -1173,24 +1173,10 @@
           <w:color w:val="000000"/>
           <w:sz w:val="24"/>
           <w:szCs w:val="24"/>
-        </w:rPr>
-        <w:t>#</w:t>
-      </w:r>
-      <w:r>
-        <w:rPr>
-          <w:color w:val="000000"/>
-          <w:sz w:val="24"/>
-          <w:szCs w:val="24"/>
-        </w:rPr>
-        <w:t>todays date</w:t>
-      </w:r>
-      <w:r>
-        <w:rPr>
-          <w:color w:val="000000"/>
-          <w:sz w:val="24"/>
-          <w:szCs w:val="24"/>
-        </w:rPr>
-        <w:t>#</w:t>
+          <w:highlight w:val="yellow"/>
+          <w:lang w:val="en-US"/>
+        </w:rPr>
+        <w:t>#todays date#</w:t>
       </w:r>
       <w:r>
         <w:rPr>
@@ -1300,81 +1286,23 @@
           <w:color w:val="000000"/>
           <w:sz w:val="24"/>
           <w:szCs w:val="24"/>
-        </w:rPr>
-        <w:t>#</w:t>
-      </w:r>
-      <w:r>
-        <w:rPr>
-          <w:color w:val="000000"/>
-          <w:sz w:val="24"/>
-          <w:szCs w:val="24"/>
-        </w:rPr>
-        <w:t>c</w:t>
-      </w:r>
-      <w:r>
-        <w:rPr>
-          <w:color w:val="000000"/>
-          <w:sz w:val="24"/>
-          <w:szCs w:val="24"/>
-        </w:rPr>
-        <w:t>lient name#</w:t>
-      </w:r>
-    </w:p>
-    <w:p>
-      <w:pPr>
+          <w:highlight w:val="yellow"/>
+        </w:rPr>
+        <w:t>#client name#</w:t>
+      </w:r>
+    </w:p>
+    <w:p>
+      <w:pPr>
+        <w:pBdr>
+          <w:top w:val="nil"/>
+          <w:left w:val="nil"/>
+          <w:bottom w:val="nil"/>
+          <w:right w:val="nil"/>
+          <w:between w:val="nil"/>
+        </w:pBdr>
         <w:ind w:left="1440" w:hanging="720"/>
         <w:jc w:val="both"/>
         <w:rPr>
-          <w:color w:val="000000"/>
-          <w:sz w:val="24"/>
-          <w:szCs w:val="24"/>
-        </w:rPr>
-      </w:pPr>
-      <w:r>
-        <w:rPr>
-          <w:color w:val="000000"/>
-          <w:sz w:val="24"/>
-          <w:szCs w:val="24"/>
-        </w:rPr>
-        <w:t>#</w:t>
-      </w:r>
-      <w:r>
-        <w:rPr>
-          <w:color w:val="000000"/>
-          <w:sz w:val="24"/>
-          <w:szCs w:val="24"/>
-        </w:rPr>
-        <w:t>c</w:t>
-      </w:r>
-      <w:r>
-        <w:rPr>
-          <w:color w:val="000000"/>
-          <w:sz w:val="24"/>
-          <w:szCs w:val="24"/>
-        </w:rPr>
-        <w:t>lient</w:t>
-      </w:r>
-      <w:r>
-        <w:rPr>
-          <w:color w:val="000000"/>
-          <w:sz w:val="24"/>
-          <w:szCs w:val="24"/>
-        </w:rPr>
-        <w:t xml:space="preserve"> address#</w:t>
-      </w:r>
-    </w:p>
-    <w:p>
-      <w:pPr>
-        <w:pBdr>
-          <w:top w:val="nil"/>
-          <w:left w:val="nil"/>
-          <w:bottom w:val="nil"/>
-          <w:right w:val="nil"/>
-          <w:between w:val="nil"/>
-        </w:pBdr>
-        <w:ind w:left="1440" w:hanging="720"/>
-        <w:jc w:val="both"/>
-        <w:rPr>
           <w:sz w:val="24"/>
           <w:szCs w:val="24"/>
           <w:highlight w:val="yellow"/>
@@ -1384,6 +1312,14 @@
         <w:rPr>
           <w:sz w:val="24"/>
           <w:szCs w:val="24"/>
+          <w:highlight w:val="yellow"/>
+        </w:rPr>
+        <w:t>#client address#</w:t>
+      </w:r>
+      <w:r>
+        <w:rPr>
+          <w:sz w:val="24"/>
+          <w:szCs w:val="24"/>
         </w:rPr>
         <w:tab/>
       </w:r>
@@ -1590,27 +1526,12 @@
       </w:r>
       <w:r>
         <w:rPr>
+          <w:color w:val="000000"/>
           <w:sz w:val="24"/>
           <w:szCs w:val="24"/>
           <w:highlight w:val="yellow"/>
         </w:rPr>
-        <w:t>#</w:t>
-      </w:r>
-      <w:r>
-        <w:rPr>
-          <w:sz w:val="24"/>
-          <w:szCs w:val="24"/>
-          <w:highlight w:val="yellow"/>
-        </w:rPr>
-        <w:t>p</w:t>
-      </w:r>
-      <w:r>
-        <w:rPr>
-          <w:sz w:val="24"/>
-          <w:szCs w:val="24"/>
-          <w:highlight w:val="yellow"/>
-        </w:rPr>
-        <w:t>roject address#</w:t>
+        <w:t>#project address#</w:t>
       </w:r>
     </w:p>
     <w:p>
@@ -1966,23 +1887,7 @@
           <w:szCs w:val="24"/>
           <w:highlight w:val="yellow"/>
         </w:rPr>
-        <w:t xml:space="preserve">#total </w:t>
-      </w:r>
-      <w:r>
-        <w:rPr>
-          <w:sz w:val="24"/>
-          <w:szCs w:val="24"/>
-          <w:highlight w:val="yellow"/>
-        </w:rPr>
-        <w:t>amount</w:t>
-      </w:r>
-      <w:r>
-        <w:rPr>
-          <w:sz w:val="24"/>
-          <w:szCs w:val="24"/>
-          <w:highlight w:val="yellow"/>
-        </w:rPr>
-        <w:t xml:space="preserve"> including profit and vat#</w:t>
+        <w:t>#total amount including profit and vat#</w:t>
       </w:r>
       <w:r>
         <w:rPr>
@@ -2435,33 +2340,33 @@
           <w:sz w:val="24"/>
           <w:szCs w:val="24"/>
         </w:rPr>
+        <w:t>TERMS &amp; CONDITIONS</w:t>
+      </w:r>
+    </w:p>
+    <w:p>
+      <w:pPr>
+        <w:pBdr>
+          <w:top w:val="nil"/>
+          <w:left w:val="nil"/>
+          <w:bottom w:val="nil"/>
+          <w:right w:val="nil"/>
+          <w:between w:val="nil"/>
+        </w:pBdr>
+        <w:jc w:val="center"/>
+        <w:rPr>
+          <w:color w:val="000000"/>
+          <w:sz w:val="24"/>
+          <w:szCs w:val="24"/>
+        </w:rPr>
+      </w:pPr>
+      <w:r>
+        <w:rPr>
+          <w:b/>
+          <w:color w:val="000000"/>
+          <w:sz w:val="24"/>
+          <w:szCs w:val="24"/>
+        </w:rPr>
         <w:lastRenderedPageBreak/>
-        <w:t>TERMS &amp; CONDITIONS</w:t>
-      </w:r>
-    </w:p>
-    <w:p>
-      <w:pPr>
-        <w:pBdr>
-          <w:top w:val="nil"/>
-          <w:left w:val="nil"/>
-          <w:bottom w:val="nil"/>
-          <w:right w:val="nil"/>
-          <w:between w:val="nil"/>
-        </w:pBdr>
-        <w:jc w:val="center"/>
-        <w:rPr>
-          <w:color w:val="000000"/>
-          <w:sz w:val="24"/>
-          <w:szCs w:val="24"/>
-        </w:rPr>
-      </w:pPr>
-      <w:r>
-        <w:rPr>
-          <w:b/>
-          <w:color w:val="000000"/>
-          <w:sz w:val="24"/>
-          <w:szCs w:val="24"/>
-        </w:rPr>
         <w:t>FOR</w:t>
       </w:r>
     </w:p>
@@ -3269,7 +3174,6 @@
           <w:sz w:val="24"/>
           <w:szCs w:val="24"/>
         </w:rPr>
-        <w:lastRenderedPageBreak/>
         <w:t>3.3</w:t>
       </w:r>
       <w:r>
@@ -4087,6 +3991,7 @@
           <w:sz w:val="24"/>
           <w:szCs w:val="24"/>
         </w:rPr>
+        <w:lastRenderedPageBreak/>
         <w:t>5.7</w:t>
       </w:r>
       <w:r>
@@ -4801,7 +4706,6 @@
           <w:sz w:val="24"/>
           <w:szCs w:val="24"/>
         </w:rPr>
-        <w:lastRenderedPageBreak/>
         <w:tab/>
         <w:t>Change</w:t>
       </w:r>
@@ -9983,23 +9887,7 @@
                 <w:szCs w:val="24"/>
                 <w:highlight w:val="yellow"/>
               </w:rPr>
-              <w:t xml:space="preserve">#total amount </w:t>
-            </w:r>
-            <w:r>
-              <w:rPr>
-                <w:sz w:val="24"/>
-                <w:szCs w:val="24"/>
-                <w:highlight w:val="yellow"/>
-              </w:rPr>
-              <w:t>including</w:t>
-            </w:r>
-            <w:r>
-              <w:rPr>
-                <w:sz w:val="24"/>
-                <w:szCs w:val="24"/>
-                <w:highlight w:val="yellow"/>
-              </w:rPr>
-              <w:t xml:space="preserve"> profit and vat#</w:t>
+              <w:t>#total amount including profit and vat#</w:t>
             </w:r>
           </w:p>
         </w:tc>
@@ -10063,23 +9951,7 @@
                 <w:szCs w:val="24"/>
                 <w:highlight w:val="yellow"/>
               </w:rPr>
-              <w:t>#</w:t>
-            </w:r>
-            <w:r>
-              <w:rPr>
-                <w:sz w:val="24"/>
-                <w:szCs w:val="24"/>
-                <w:highlight w:val="yellow"/>
-              </w:rPr>
-              <w:t>todays</w:t>
-            </w:r>
-            <w:r>
-              <w:rPr>
-                <w:sz w:val="24"/>
-                <w:szCs w:val="24"/>
-                <w:highlight w:val="yellow"/>
-              </w:rPr>
-              <w:t xml:space="preserve"> date#</w:t>
+              <w:t xml:space="preserve">#todays date# </w:t>
             </w:r>
           </w:p>
         </w:tc>
@@ -10146,23 +10018,7 @@
                 <w:szCs w:val="24"/>
                 <w:highlight w:val="yellow"/>
               </w:rPr>
-              <w:t>#</w:t>
-            </w:r>
-            <w:r>
-              <w:rPr>
-                <w:sz w:val="24"/>
-                <w:szCs w:val="24"/>
-                <w:highlight w:val="yellow"/>
-              </w:rPr>
-              <w:t>project start</w:t>
-            </w:r>
-            <w:r>
-              <w:rPr>
-                <w:sz w:val="24"/>
-                <w:szCs w:val="24"/>
-                <w:highlight w:val="yellow"/>
-              </w:rPr>
-              <w:t xml:space="preserve"> date#</w:t>
+              <w:t>#project start date#</w:t>
             </w:r>
           </w:p>
         </w:tc>
@@ -10226,23 +10082,7 @@
                 <w:szCs w:val="24"/>
                 <w:highlight w:val="yellow"/>
               </w:rPr>
-              <w:t>#</w:t>
-            </w:r>
-            <w:r>
-              <w:rPr>
-                <w:sz w:val="24"/>
-                <w:szCs w:val="24"/>
-                <w:highlight w:val="yellow"/>
-              </w:rPr>
-              <w:t>project end</w:t>
-            </w:r>
-            <w:r>
-              <w:rPr>
-                <w:sz w:val="24"/>
-                <w:szCs w:val="24"/>
-                <w:highlight w:val="yellow"/>
-              </w:rPr>
-              <w:t xml:space="preserve"> date#</w:t>
+              <w:t>#project end date#</w:t>
             </w:r>
           </w:p>
         </w:tc>
@@ -10403,32 +10243,12 @@
             </w:pPr>
             <w:r>
               <w:rPr>
-                <w:i/>
-                <w:color w:val="000000"/>
+                <w:iCs/>
                 <w:sz w:val="24"/>
                 <w:szCs w:val="24"/>
                 <w:highlight w:val="yellow"/>
               </w:rPr>
-              <w:t>#</w:t>
-            </w:r>
-            <w:r>
-              <w:rPr>
-                <w:iCs/>
-                <w:color w:val="000000"/>
-                <w:sz w:val="24"/>
-                <w:szCs w:val="24"/>
-                <w:highlight w:val="yellow"/>
-              </w:rPr>
-              <w:t>defects period</w:t>
-            </w:r>
-            <w:r>
-              <w:rPr>
-                <w:i/>
-                <w:sz w:val="24"/>
-                <w:szCs w:val="24"/>
-                <w:highlight w:val="yellow"/>
-              </w:rPr>
-              <w:t>#</w:t>
+              <w:t>#defects period#</w:t>
             </w:r>
             <w:r>
               <w:rPr>
@@ -11468,38 +11288,24 @@
               <w:keepNext w:val="0"/>
               <w:keepLines w:val="0"/>
               <w:rPr>
-                <w:sz w:val="30"/>
-                <w:szCs w:val="30"/>
-                <w:highlight w:val="yellow"/>
-              </w:rPr>
-            </w:pPr>
-            <w:bookmarkStart w:id="0" w:name="_heading=h.wkpexg3q8ztz" w:colFirst="0" w:colLast="0"/>
-            <w:bookmarkEnd w:id="0"/>
-            <w:r>
-              <w:rPr>
-                <w:sz w:val="30"/>
-                <w:szCs w:val="30"/>
-                <w:highlight w:val="yellow"/>
-              </w:rPr>
-              <w:t>#</w:t>
-            </w:r>
-            <w:r>
-              <w:rPr>
                 <w:b w:val="0"/>
                 <w:bCs/>
                 <w:sz w:val="30"/>
                 <w:szCs w:val="30"/>
                 <w:highlight w:val="yellow"/>
               </w:rPr>
-              <w:t>project address</w:t>
-            </w:r>
+            </w:pPr>
+            <w:bookmarkStart w:id="0" w:name="_heading=h.wkpexg3q8ztz" w:colFirst="0" w:colLast="0"/>
+            <w:bookmarkEnd w:id="0"/>
             <w:r>
               <w:rPr>
+                <w:b w:val="0"/>
+                <w:bCs/>
                 <w:sz w:val="30"/>
                 <w:szCs w:val="30"/>
                 <w:highlight w:val="yellow"/>
               </w:rPr>
-              <w:t>#</w:t>
+              <w:t>#project address#</w:t>
             </w:r>
           </w:p>
           <w:p/>
@@ -11742,27 +11548,12 @@
       </w:r>
       <w:r>
         <w:rPr>
+          <w:color w:val="000000"/>
           <w:sz w:val="24"/>
           <w:szCs w:val="24"/>
           <w:highlight w:val="yellow"/>
         </w:rPr>
-        <w:t xml:space="preserve">#total amount </w:t>
-      </w:r>
-      <w:r>
-        <w:rPr>
-          <w:sz w:val="24"/>
-          <w:szCs w:val="24"/>
-          <w:highlight w:val="yellow"/>
-        </w:rPr>
-        <w:t>including</w:t>
-      </w:r>
-      <w:r>
-        <w:rPr>
-          <w:sz w:val="24"/>
-          <w:szCs w:val="24"/>
-          <w:highlight w:val="yellow"/>
-        </w:rPr>
-        <w:t xml:space="preserve"> profit and vat#</w:t>
+        <w:t>#total amount including profit and vat#</w:t>
       </w:r>
     </w:p>
     <w:p>
@@ -11990,25 +11781,24 @@
           <w:sz w:val="24"/>
           <w:szCs w:val="24"/>
         </w:rPr>
-        <w:t xml:space="preserve">£ </w:t>
-      </w:r>
-      <w:r>
-        <w:rPr>
+        <w:t>£</w:t>
+      </w:r>
+      <w:r>
+        <w:rPr>
+          <w:color w:val="000000"/>
+          <w:sz w:val="24"/>
+          <w:szCs w:val="24"/>
+        </w:rPr>
+        <w:t xml:space="preserve"> </w:t>
+      </w:r>
+      <w:r>
+        <w:rPr>
+          <w:color w:val="000000"/>
           <w:sz w:val="24"/>
           <w:szCs w:val="24"/>
           <w:highlight w:val="yellow"/>
-          <w:shd w:val="clear" w:color="auto" w:fill="D3D3D3"/>
-        </w:rPr>
-        <w:t>#</w:t>
-      </w:r>
-      <w:r>
-        <w:rPr>
-          <w:sz w:val="24"/>
-          <w:szCs w:val="24"/>
-          <w:highlight w:val="yellow"/>
-          <w:shd w:val="clear" w:color="auto" w:fill="D3D3D3"/>
-        </w:rPr>
-        <w:t>deposit#</w:t>
+        </w:rPr>
+        <w:t>#deposit#</w:t>
       </w:r>
       <w:r>
         <w:rPr>

</xml_diff>

<commit_message>
Run downloading the generated document.
</commit_message>
<xml_diff>
--- a/docs/gendoc/client_contract.docx
+++ b/docs/gendoc/client_contract.docx
@@ -2302,6 +2302,23 @@
     </w:p>
     <w:p>
       <w:pPr>
+        <w:rPr>
+          <w:color w:val="000000"/>
+          <w:sz w:val="24"/>
+          <w:szCs w:val="24"/>
+        </w:rPr>
+      </w:pPr>
+      <w:r>
+        <w:rPr>
+          <w:color w:val="000000"/>
+          <w:sz w:val="24"/>
+          <w:szCs w:val="24"/>
+        </w:rPr>
+        <w:br w:type="page"/>
+      </w:r>
+    </w:p>
+    <w:p>
+      <w:pPr>
         <w:pBdr>
           <w:top w:val="nil"/>
           <w:left w:val="nil"/>
@@ -2316,6 +2333,16 @@
           <w:szCs w:val="24"/>
         </w:rPr>
       </w:pPr>
+      <w:r>
+        <w:rPr>
+          <w:b/>
+          <w:color w:val="000000"/>
+          <w:sz w:val="24"/>
+          <w:szCs w:val="24"/>
+        </w:rPr>
+        <w:lastRenderedPageBreak/>
+        <w:t>TERMS &amp; CONDITIONS</w:t>
+      </w:r>
     </w:p>
     <w:p>
       <w:pPr>
@@ -2340,33 +2367,6 @@
           <w:sz w:val="24"/>
           <w:szCs w:val="24"/>
         </w:rPr>
-        <w:t>TERMS &amp; CONDITIONS</w:t>
-      </w:r>
-    </w:p>
-    <w:p>
-      <w:pPr>
-        <w:pBdr>
-          <w:top w:val="nil"/>
-          <w:left w:val="nil"/>
-          <w:bottom w:val="nil"/>
-          <w:right w:val="nil"/>
-          <w:between w:val="nil"/>
-        </w:pBdr>
-        <w:jc w:val="center"/>
-        <w:rPr>
-          <w:color w:val="000000"/>
-          <w:sz w:val="24"/>
-          <w:szCs w:val="24"/>
-        </w:rPr>
-      </w:pPr>
-      <w:r>
-        <w:rPr>
-          <w:b/>
-          <w:color w:val="000000"/>
-          <w:sz w:val="24"/>
-          <w:szCs w:val="24"/>
-        </w:rPr>
-        <w:lastRenderedPageBreak/>
         <w:t>FOR</w:t>
       </w:r>
     </w:p>
@@ -3174,6 +3174,7 @@
           <w:sz w:val="24"/>
           <w:szCs w:val="24"/>
         </w:rPr>
+        <w:lastRenderedPageBreak/>
         <w:t>3.3</w:t>
       </w:r>
       <w:r>
@@ -3991,7 +3992,6 @@
           <w:sz w:val="24"/>
           <w:szCs w:val="24"/>
         </w:rPr>
-        <w:lastRenderedPageBreak/>
         <w:t>5.7</w:t>
       </w:r>
       <w:r>
@@ -4543,89 +4543,18 @@
     </w:p>
     <w:p>
       <w:pPr>
-        <w:pBdr>
-          <w:top w:val="nil"/>
-          <w:left w:val="nil"/>
-          <w:bottom w:val="nil"/>
-          <w:right w:val="nil"/>
-          <w:between w:val="nil"/>
-        </w:pBdr>
-        <w:ind w:left="720" w:hanging="720"/>
-        <w:jc w:val="both"/>
-        <w:rPr>
-          <w:sz w:val="24"/>
-          <w:szCs w:val="24"/>
-        </w:rPr>
-      </w:pPr>
-    </w:p>
-    <w:p>
-      <w:pPr>
-        <w:pBdr>
-          <w:top w:val="nil"/>
-          <w:left w:val="nil"/>
-          <w:bottom w:val="nil"/>
-          <w:right w:val="nil"/>
-          <w:between w:val="nil"/>
-        </w:pBdr>
-        <w:ind w:left="720" w:hanging="720"/>
-        <w:jc w:val="both"/>
-        <w:rPr>
-          <w:sz w:val="24"/>
-          <w:szCs w:val="24"/>
-        </w:rPr>
-      </w:pPr>
-    </w:p>
-    <w:p>
-      <w:pPr>
-        <w:pBdr>
-          <w:top w:val="nil"/>
-          <w:left w:val="nil"/>
-          <w:bottom w:val="nil"/>
-          <w:right w:val="nil"/>
-          <w:between w:val="nil"/>
-        </w:pBdr>
-        <w:ind w:left="720" w:hanging="720"/>
-        <w:jc w:val="both"/>
-        <w:rPr>
-          <w:sz w:val="24"/>
-          <w:szCs w:val="24"/>
-        </w:rPr>
-      </w:pPr>
-    </w:p>
-    <w:p>
-      <w:pPr>
-        <w:pBdr>
-          <w:top w:val="nil"/>
-          <w:left w:val="nil"/>
-          <w:bottom w:val="nil"/>
-          <w:right w:val="nil"/>
-          <w:between w:val="nil"/>
-        </w:pBdr>
-        <w:ind w:left="720" w:hanging="720"/>
-        <w:jc w:val="both"/>
-        <w:rPr>
-          <w:sz w:val="24"/>
-          <w:szCs w:val="24"/>
-        </w:rPr>
-      </w:pPr>
-    </w:p>
-    <w:p>
-      <w:pPr>
-        <w:pBdr>
-          <w:top w:val="nil"/>
-          <w:left w:val="nil"/>
-          <w:bottom w:val="nil"/>
-          <w:right w:val="nil"/>
-          <w:between w:val="nil"/>
-        </w:pBdr>
-        <w:ind w:left="720" w:hanging="720"/>
-        <w:jc w:val="both"/>
-        <w:rPr>
-          <w:color w:val="000000"/>
-          <w:sz w:val="24"/>
-          <w:szCs w:val="24"/>
-        </w:rPr>
-      </w:pPr>
+        <w:rPr>
+          <w:sz w:val="24"/>
+          <w:szCs w:val="24"/>
+        </w:rPr>
+      </w:pPr>
+      <w:r>
+        <w:rPr>
+          <w:sz w:val="24"/>
+          <w:szCs w:val="24"/>
+        </w:rPr>
+        <w:br w:type="page"/>
+      </w:r>
     </w:p>
     <w:p>
       <w:pPr>
@@ -4651,6 +4580,7 @@
           <w:sz w:val="24"/>
           <w:szCs w:val="24"/>
         </w:rPr>
+        <w:lastRenderedPageBreak/>
         <w:t>7.</w:t>
       </w:r>
       <w:r>
@@ -5269,6 +5199,7 @@
           <w:sz w:val="24"/>
           <w:szCs w:val="24"/>
         </w:rPr>
+        <w:lastRenderedPageBreak/>
         <w:t>7.9</w:t>
       </w:r>
       <w:r>
@@ -5326,7 +5257,6 @@
           <w:sz w:val="24"/>
           <w:szCs w:val="24"/>
         </w:rPr>
-        <w:lastRenderedPageBreak/>
         <w:t xml:space="preserve">Unforeseen ground conditions unless they could not have been foreseen by a contractor before commencing the works, who had seen all available information and reports and inspected the site before signing the </w:t>
       </w:r>
       <w:proofErr w:type="gramStart"/>
@@ -5978,7 +5908,6 @@
           <w:sz w:val="24"/>
           <w:szCs w:val="24"/>
         </w:rPr>
-        <w:lastRenderedPageBreak/>
         <w:t>9.4</w:t>
       </w:r>
       <w:r>
@@ -6714,7 +6643,7 @@
           <w:szCs w:val="24"/>
         </w:rPr>
         <w:tab/>
-        <w:t xml:space="preserve"> The Client may employ another contractor to complete the work.  The Contractor shall be entitled to be paid for work properly performed in accordance with the Contract but shall be liable to the Client for all extra costs and expenses incurred by the Client in having the Works completed by another contractor.  No money shall be payable to the Contractor following termination until the </w:t>
+        <w:t xml:space="preserve"> The Client may employ another contractor to complete the work.  The Contractor shall be entitled to be paid for work properly performed in accordance with the Contract but shall be liable to the Client for all extra costs and expenses incurred by the Client in having the Works completed by </w:t>
       </w:r>
       <w:r>
         <w:rPr>
@@ -6723,7 +6652,7 @@
           <w:szCs w:val="24"/>
         </w:rPr>
         <w:lastRenderedPageBreak/>
-        <w:t>Client's recoverable costs and expenses have been assessed and paid to the Client by the Contractor or deducted from money owing to the Contractor.</w:t>
+        <w:t>another contractor.  No money shall be payable to the Contractor following termination until the Client's recoverable costs and expenses have been assessed and paid to the Client by the Contractor or deducted from money owing to the Contractor.</w:t>
       </w:r>
     </w:p>
     <w:p>
@@ -7343,82 +7272,46 @@
     </w:p>
     <w:p>
       <w:pPr>
-        <w:pBdr>
-          <w:top w:val="nil"/>
-          <w:left w:val="nil"/>
-          <w:bottom w:val="nil"/>
-          <w:right w:val="nil"/>
-          <w:between w:val="nil"/>
-        </w:pBdr>
-        <w:ind w:left="720" w:hanging="720"/>
-        <w:jc w:val="both"/>
         <w:rPr>
           <w:b/>
           <w:sz w:val="24"/>
           <w:szCs w:val="24"/>
         </w:rPr>
       </w:pPr>
-    </w:p>
-    <w:p>
-      <w:pPr>
-        <w:pBdr>
-          <w:top w:val="nil"/>
-          <w:left w:val="nil"/>
-          <w:bottom w:val="nil"/>
-          <w:right w:val="nil"/>
-          <w:between w:val="nil"/>
-        </w:pBdr>
-        <w:ind w:left="720" w:hanging="720"/>
-        <w:jc w:val="both"/>
+      <w:r>
         <w:rPr>
           <w:b/>
           <w:sz w:val="24"/>
           <w:szCs w:val="24"/>
         </w:rPr>
-      </w:pPr>
-    </w:p>
-    <w:p>
-      <w:pPr>
-        <w:pBdr>
-          <w:top w:val="nil"/>
-          <w:left w:val="nil"/>
-          <w:bottom w:val="nil"/>
-          <w:right w:val="nil"/>
-          <w:between w:val="nil"/>
-        </w:pBdr>
-        <w:ind w:left="720" w:hanging="720"/>
-        <w:jc w:val="both"/>
+        <w:br w:type="page"/>
+      </w:r>
+    </w:p>
+    <w:p>
+      <w:pPr>
+        <w:pBdr>
+          <w:top w:val="nil"/>
+          <w:left w:val="nil"/>
+          <w:bottom w:val="nil"/>
+          <w:right w:val="nil"/>
+          <w:between w:val="nil"/>
+        </w:pBdr>
+        <w:ind w:left="720" w:hanging="720"/>
+        <w:jc w:val="both"/>
+        <w:rPr>
+          <w:color w:val="000000"/>
+          <w:sz w:val="24"/>
+          <w:szCs w:val="24"/>
+        </w:rPr>
+      </w:pPr>
+      <w:r>
         <w:rPr>
           <w:b/>
-          <w:sz w:val="24"/>
-          <w:szCs w:val="24"/>
-        </w:rPr>
-      </w:pPr>
-    </w:p>
-    <w:p>
-      <w:pPr>
-        <w:pBdr>
-          <w:top w:val="nil"/>
-          <w:left w:val="nil"/>
-          <w:bottom w:val="nil"/>
-          <w:right w:val="nil"/>
-          <w:between w:val="nil"/>
-        </w:pBdr>
-        <w:ind w:left="720" w:hanging="720"/>
-        <w:jc w:val="both"/>
-        <w:rPr>
-          <w:color w:val="000000"/>
-          <w:sz w:val="24"/>
-          <w:szCs w:val="24"/>
-        </w:rPr>
-      </w:pPr>
-      <w:r>
-        <w:rPr>
-          <w:b/>
-          <w:color w:val="000000"/>
-          <w:sz w:val="24"/>
-          <w:szCs w:val="24"/>
-        </w:rPr>
+          <w:color w:val="000000"/>
+          <w:sz w:val="24"/>
+          <w:szCs w:val="24"/>
+        </w:rPr>
+        <w:lastRenderedPageBreak/>
         <w:t>15.</w:t>
       </w:r>
       <w:r>
@@ -7498,16 +7391,7 @@
           <w:sz w:val="24"/>
           <w:szCs w:val="24"/>
         </w:rPr>
-        <w:t xml:space="preserve">.  Every notice required under the Contract must be in writing and delivered by hand or sent by first class post to the address of the recipient.  A notice sent by post shall be treated as having </w:t>
-      </w:r>
-      <w:r>
-        <w:rPr>
-          <w:color w:val="000000"/>
-          <w:sz w:val="24"/>
-          <w:szCs w:val="24"/>
-        </w:rPr>
-        <w:lastRenderedPageBreak/>
-        <w:t xml:space="preserve">been received two working days after posting.  A notice delivered by hand shall be treated as having been received at the time of delivery unless this is after the normal working hours of the recipient, in which case delivery shall be treated as occurring at 9.00 a.m. on the next working day. </w:t>
+        <w:t xml:space="preserve">.  Every notice required under the Contract must be in writing and delivered by hand or sent by first class post to the address of the recipient.  A notice sent by post shall be treated as having been received two working days after posting.  A notice delivered by hand shall be treated as having been received at the time of delivery unless this is after the normal working hours of the recipient, in which case delivery shall be treated as occurring at 9.00 a.m. on the next working day. </w:t>
       </w:r>
     </w:p>
     <w:p>
@@ -8230,7 +8114,16 @@
           <w:szCs w:val="24"/>
         </w:rPr>
         <w:tab/>
-        <w:t xml:space="preserve">The parties may agree to refer a dispute to mediation in which case any other procedure under this clause 16 shall be delayed until 42 days after the mediator has been appointed (or other period agreed by the parties).  The mediation shall be conducted in accordance with the procedure named in the </w:t>
+        <w:t xml:space="preserve">The parties may agree to refer a dispute to mediation in which case any other procedure under this clause 16 shall be delayed until 42 days after the mediator has been appointed (or other period </w:t>
+      </w:r>
+      <w:r>
+        <w:rPr>
+          <w:color w:val="000000"/>
+          <w:sz w:val="24"/>
+          <w:szCs w:val="24"/>
+        </w:rPr>
+        <w:lastRenderedPageBreak/>
+        <w:t xml:space="preserve">agreed by the parties).  The mediation shall be conducted in accordance with the procedure named in the </w:t>
       </w:r>
       <w:proofErr w:type="gramStart"/>
       <w:r>
@@ -9504,6 +9397,7 @@
                 <w:sz w:val="24"/>
                 <w:szCs w:val="24"/>
               </w:rPr>
+              <w:lastRenderedPageBreak/>
               <w:t>“Site”</w:t>
             </w:r>
           </w:p>
@@ -9674,7 +9568,6 @@
                 <w:sz w:val="24"/>
                 <w:szCs w:val="24"/>
               </w:rPr>
-              <w:lastRenderedPageBreak/>
               <w:t>"Works"</w:t>
             </w:r>
           </w:p>

</xml_diff>